<commit_message>
Replaced useless args with practice_ids
</commit_message>
<xml_diff>
--- a/templates/Report_template.docx
+++ b/templates/Report_template.docx
@@ -559,7 +559,7 @@
         </w:rPr>
         <w:t xml:space="preserve">на электронную почту </w:t>
       </w:r>
-      <w:hyperlink r:id="rId7" w:history="1">
+      <w:hyperlink r:id="rId6" w:history="1">
         <w:r>
           <w:rPr>
             <w:rStyle w:val="ab"/>
@@ -1742,7 +1742,10 @@
               </w:rPr>
             </w:pPr>
             <w:r>
-              <w:t xml:space="preserve">{%tr for a in groups %}</w:t>
+              <w:rPr>
+                <w:lang w:val="en-US"/>
+              </w:rPr>
+              <w:t>{%tr for a in groups %}</w:t>
             </w:r>
           </w:p>
         </w:tc>
@@ -1918,6 +1921,7 @@
                 <w:color w:val="000000"/>
                 <w:sz w:val="20"/>
                 <w:szCs w:val="20"/>
+                <w:lang w:val="en-US"/>
               </w:rPr>
             </w:pPr>
           </w:p>
@@ -1972,11 +1976,19 @@
                 <w:szCs w:val="20"/>
                 <w:lang w:val="en-US"/>
               </w:rPr>
-              <w:t>{{ a.group_name }}</w:t>
+              <w:t>{{ a</w:t>
             </w:r>
-            <w:proofErr w:type="spellStart"/>
             <w:proofErr w:type="gramEnd"/>
-            <w:proofErr w:type="spellEnd"/>
+            <w:r>
+              <w:rPr>
+                <w:rFonts w:ascii="Times New Roman" w:eastAsia="Times New Roman" w:hAnsi="Times New Roman" w:cs="Times New Roman"/>
+                <w:color w:val="000000"/>
+                <w:sz w:val="20"/>
+                <w:szCs w:val="20"/>
+                <w:lang w:val="en-US"/>
+              </w:rPr>
+              <w:t>.group_name }}</w:t>
+            </w:r>
           </w:p>
         </w:tc>
         <w:tc>
@@ -2006,11 +2018,9 @@
                 <w:szCs w:val="20"/>
                 <w:lang w:val="en-US"/>
               </w:rPr>
-              <w:t>{{ a.start_date }}</w:t>
+              <w:t>{{ a</w:t>
             </w:r>
-            <w:proofErr w:type="spellStart"/>
             <w:proofErr w:type="gramEnd"/>
-            <w:proofErr w:type="spellEnd"/>
             <w:r>
               <w:rPr>
                 <w:rFonts w:ascii="Times New Roman" w:eastAsia="Times New Roman" w:hAnsi="Times New Roman" w:cs="Times New Roman"/>
@@ -2020,10 +2030,8 @@
                 <w:szCs w:val="20"/>
                 <w:lang w:val="en-US"/>
               </w:rPr>
-              <w:t>-{{ a.end_date }}</w:t>
+              <w:t>.start_date }}-{{ a.end_date }}</w:t>
             </w:r>
-            <w:proofErr w:type="spellStart"/>
-            <w:proofErr w:type="spellEnd"/>
           </w:p>
         </w:tc>
         <w:tc>
@@ -2046,40 +2054,79 @@
                 <w:lang w:val="en-US"/>
               </w:rPr>
             </w:pPr>
+            <w:r>
+              <w:rPr>
+                <w:rFonts w:ascii="Times New Roman" w:eastAsia="Times New Roman" w:hAnsi="Times New Roman" w:cs="Times New Roman"/>
+                <w:b/>
+                <w:color w:val="000000"/>
+                <w:sz w:val="20"/>
+                <w:szCs w:val="20"/>
+                <w:lang w:val="en-US"/>
+              </w:rPr>
+              <w:t xml:space="preserve">{{ </w:t>
+            </w:r>
+            <w:r>
+              <w:rPr>
+                <w:rFonts w:ascii="Times New Roman" w:eastAsia="Times New Roman" w:hAnsi="Times New Roman" w:cs="Times New Roman"/>
+                <w:b/>
+                <w:color w:val="000000"/>
+                <w:sz w:val="20"/>
+                <w:szCs w:val="20"/>
+              </w:rPr>
+              <w:t>a</w:t>
+            </w:r>
+            <w:r>
+              <w:rPr>
+                <w:rFonts w:ascii="Times New Roman" w:eastAsia="Times New Roman" w:hAnsi="Times New Roman" w:cs="Times New Roman"/>
+                <w:b/>
+                <w:color w:val="000000"/>
+                <w:sz w:val="20"/>
+                <w:szCs w:val="20"/>
+                <w:lang w:val="en-US"/>
+              </w:rPr>
+              <w:t>.</w:t>
+            </w:r>
+            <w:r>
+              <w:rPr>
+                <w:rFonts w:ascii="Times New Roman" w:eastAsia="Times New Roman" w:hAnsi="Times New Roman" w:cs="Times New Roman"/>
+                <w:b/>
+                <w:color w:val="000000"/>
+                <w:sz w:val="20"/>
+                <w:szCs w:val="20"/>
+                <w:lang w:val="en-US"/>
+              </w:rPr>
+              <w:t>practice_type }}</w:t>
+            </w:r>
+          </w:p>
+        </w:tc>
+        <w:tc>
+          <w:tcPr>
+            <w:tcW w:w="1134" w:type="dxa"/>
+            <w:vAlign w:val="center"/>
+          </w:tcPr>
+          <w:p>
+            <w:pPr>
+              <w:spacing w:after="0" w:line="240" w:lineRule="auto"/>
+              <w:rPr>
+                <w:rFonts w:ascii="Times New Roman" w:eastAsia="Times New Roman" w:hAnsi="Times New Roman" w:cs="Times New Roman"/>
+                <w:color w:val="000000"/>
+                <w:sz w:val="20"/>
+                <w:szCs w:val="20"/>
+                <w:lang w:val="en-US"/>
+              </w:rPr>
+            </w:pPr>
             <w:proofErr w:type="gramStart"/>
             <w:r>
               <w:rPr>
                 <w:rFonts w:ascii="Times New Roman" w:eastAsia="Times New Roman" w:hAnsi="Times New Roman" w:cs="Times New Roman"/>
-                <w:b/>
-                <w:color w:val="000000"/>
-                <w:sz w:val="20"/>
-                <w:szCs w:val="20"/>
-                <w:lang w:val="en-US"/>
-              </w:rPr>
-              <w:t>{{ practice_type }}</w:t>
+                <w:color w:val="000000"/>
+                <w:sz w:val="20"/>
+                <w:szCs w:val="20"/>
+                <w:lang w:val="en-US"/>
+              </w:rPr>
+              <w:t>{{ a</w:t>
             </w:r>
-            <w:proofErr w:type="spellStart"/>
             <w:proofErr w:type="gramEnd"/>
-            <w:proofErr w:type="spellEnd"/>
-          </w:p>
-        </w:tc>
-        <w:tc>
-          <w:tcPr>
-            <w:tcW w:w="1134" w:type="dxa"/>
-            <w:vAlign w:val="center"/>
-          </w:tcPr>
-          <w:p>
-            <w:pPr>
-              <w:spacing w:after="0" w:line="240" w:lineRule="auto"/>
-              <w:rPr>
-                <w:rFonts w:ascii="Times New Roman" w:eastAsia="Times New Roman" w:hAnsi="Times New Roman" w:cs="Times New Roman"/>
-                <w:color w:val="000000"/>
-                <w:sz w:val="20"/>
-                <w:szCs w:val="20"/>
-                <w:lang w:val="en-US"/>
-              </w:rPr>
-            </w:pPr>
-            <w:proofErr w:type="gramStart"/>
             <w:r>
               <w:rPr>
                 <w:rFonts w:ascii="Times New Roman" w:eastAsia="Times New Roman" w:hAnsi="Times New Roman" w:cs="Times New Roman"/>
@@ -2088,11 +2135,8 @@
                 <w:szCs w:val="20"/>
                 <w:lang w:val="en-US"/>
               </w:rPr>
-              <w:t>{{ a.count_stud }}</w:t>
+              <w:t>.count_stud }}</w:t>
             </w:r>
-            <w:proofErr w:type="spellStart"/>
-            <w:proofErr w:type="gramEnd"/>
-            <w:proofErr w:type="spellEnd"/>
           </w:p>
         </w:tc>
         <w:tc>
@@ -2237,11 +2281,19 @@
                 <w:szCs w:val="20"/>
                 <w:lang w:val="en-US"/>
               </w:rPr>
-              <w:t>{{ a.payed_students }}</w:t>
+              <w:t>{{ a</w:t>
             </w:r>
-            <w:proofErr w:type="spellStart"/>
             <w:proofErr w:type="gramEnd"/>
-            <w:proofErr w:type="spellEnd"/>
+            <w:r>
+              <w:rPr>
+                <w:rFonts w:ascii="Times New Roman" w:eastAsia="Times New Roman" w:hAnsi="Times New Roman" w:cs="Times New Roman"/>
+                <w:color w:val="000000"/>
+                <w:sz w:val="20"/>
+                <w:szCs w:val="20"/>
+                <w:lang w:val="en-US"/>
+              </w:rPr>
+              <w:t>.payed_students }}</w:t>
+            </w:r>
           </w:p>
         </w:tc>
       </w:tr>
@@ -2449,7 +2501,7 @@
               </w:rPr>
             </w:pPr>
             <w:r>
-              <w:t xml:space="preserve">{%tr endfor %}</w:t>
+              <w:t>{%tr endfor %}</w:t>
             </w:r>
           </w:p>
         </w:tc>
@@ -3129,7 +3181,10 @@
               </w:rPr>
             </w:pPr>
             <w:r>
-              <w:t xml:space="preserve">{%tr for a in groups %}</w:t>
+              <w:rPr>
+                <w:lang w:val="en-US"/>
+              </w:rPr>
+              <w:t>{%tr for a in groups %}</w:t>
             </w:r>
           </w:p>
         </w:tc>
@@ -3144,6 +3199,7 @@
                 <w:rFonts w:ascii="Times New Roman" w:hAnsi="Times New Roman" w:cs="Times New Roman"/>
                 <w:sz w:val="24"/>
                 <w:szCs w:val="24"/>
+                <w:lang w:val="en-US"/>
               </w:rPr>
             </w:pPr>
           </w:p>
@@ -3159,6 +3215,7 @@
                 <w:rFonts w:ascii="Times New Roman" w:hAnsi="Times New Roman" w:cs="Times New Roman"/>
                 <w:sz w:val="24"/>
                 <w:szCs w:val="24"/>
+                <w:lang w:val="en-US"/>
               </w:rPr>
             </w:pPr>
           </w:p>
@@ -3174,6 +3231,7 @@
                 <w:rFonts w:ascii="Times New Roman" w:hAnsi="Times New Roman" w:cs="Times New Roman"/>
                 <w:sz w:val="24"/>
                 <w:szCs w:val="24"/>
+                <w:lang w:val="en-US"/>
               </w:rPr>
             </w:pPr>
           </w:p>
@@ -3189,6 +3247,7 @@
                 <w:rFonts w:ascii="Times New Roman" w:hAnsi="Times New Roman" w:cs="Times New Roman"/>
                 <w:sz w:val="24"/>
                 <w:szCs w:val="24"/>
+                <w:lang w:val="en-US"/>
               </w:rPr>
             </w:pPr>
           </w:p>
@@ -3204,6 +3263,7 @@
                 <w:rFonts w:ascii="Times New Roman" w:hAnsi="Times New Roman" w:cs="Times New Roman"/>
                 <w:sz w:val="24"/>
                 <w:szCs w:val="24"/>
+                <w:lang w:val="en-US"/>
               </w:rPr>
             </w:pPr>
           </w:p>
@@ -3231,61 +3291,34 @@
                 <w:szCs w:val="24"/>
                 <w:lang w:val="en-US"/>
               </w:rPr>
-              <w:t>{{a.group_name}}</w:t>
+              <w:lastRenderedPageBreak/>
+              <w:t>{{</w:t>
             </w:r>
-            <w:proofErr w:type="spellStart"/>
             <w:proofErr w:type="gramStart"/>
-            <w:proofErr w:type="gramEnd"/>
-            <w:proofErr w:type="spellEnd"/>
-          </w:p>
-        </w:tc>
-        <w:tc>
-          <w:tcPr>
-            <w:tcW w:w="1551" w:type="dxa"/>
-          </w:tcPr>
-          <w:p>
-            <w:pPr>
-              <w:jc w:val="both"/>
+            <w:r>
               <w:rPr>
                 <w:rFonts w:ascii="Times New Roman" w:hAnsi="Times New Roman" w:cs="Times New Roman"/>
                 <w:sz w:val="24"/>
                 <w:szCs w:val="24"/>
-              </w:rPr>
-            </w:pPr>
-            <w:proofErr w:type="gramStart"/>
+                <w:lang w:val="en-US"/>
+              </w:rPr>
+              <w:t>a.group</w:t>
+            </w:r>
+            <w:proofErr w:type="gramEnd"/>
             <w:r>
-              <w:rPr>
-                <w:rFonts w:ascii="Times New Roman" w:eastAsia="Times New Roman" w:hAnsi="Times New Roman" w:cs="Times New Roman"/>
-                <w:color w:val="000000"/>
-                <w:sz w:val="20"/>
-                <w:szCs w:val="20"/>
-                <w:lang w:val="en-US"/>
-              </w:rPr>
-              <w:t>{{ a.count_stud }}</w:t>
-            </w:r>
-            <w:proofErr w:type="spellStart"/>
-            <w:proofErr w:type="gramEnd"/>
-            <w:proofErr w:type="spellEnd"/>
-          </w:p>
-        </w:tc>
-        <w:tc>
-          <w:tcPr>
-            <w:tcW w:w="1521" w:type="dxa"/>
-          </w:tcPr>
-          <w:p>
-            <w:pPr>
-              <w:jc w:val="both"/>
               <w:rPr>
                 <w:rFonts w:ascii="Times New Roman" w:hAnsi="Times New Roman" w:cs="Times New Roman"/>
                 <w:sz w:val="24"/>
                 <w:szCs w:val="24"/>
-              </w:rPr>
-            </w:pPr>
-          </w:p>
-        </w:tc>
-        <w:tc>
-          <w:tcPr>
-            <w:tcW w:w="1508" w:type="dxa"/>
+                <w:lang w:val="en-US"/>
+              </w:rPr>
+              <w:t>_name}}</w:t>
+            </w:r>
+          </w:p>
+        </w:tc>
+        <w:tc>
+          <w:tcPr>
+            <w:tcW w:w="1551" w:type="dxa"/>
           </w:tcPr>
           <w:p>
             <w:pPr>
@@ -3296,11 +3329,33 @@
                 <w:szCs w:val="24"/>
               </w:rPr>
             </w:pPr>
-          </w:p>
-        </w:tc>
-        <w:tc>
-          <w:tcPr>
-            <w:tcW w:w="2244" w:type="dxa"/>
+            <w:proofErr w:type="gramStart"/>
+            <w:r>
+              <w:rPr>
+                <w:rFonts w:ascii="Times New Roman" w:eastAsia="Times New Roman" w:hAnsi="Times New Roman" w:cs="Times New Roman"/>
+                <w:color w:val="000000"/>
+                <w:sz w:val="20"/>
+                <w:szCs w:val="20"/>
+                <w:lang w:val="en-US"/>
+              </w:rPr>
+              <w:t>{{ a</w:t>
+            </w:r>
+            <w:proofErr w:type="gramEnd"/>
+            <w:r>
+              <w:rPr>
+                <w:rFonts w:ascii="Times New Roman" w:eastAsia="Times New Roman" w:hAnsi="Times New Roman" w:cs="Times New Roman"/>
+                <w:color w:val="000000"/>
+                <w:sz w:val="20"/>
+                <w:szCs w:val="20"/>
+                <w:lang w:val="en-US"/>
+              </w:rPr>
+              <w:t>.count_stud }}</w:t>
+            </w:r>
+          </w:p>
+        </w:tc>
+        <w:tc>
+          <w:tcPr>
+            <w:tcW w:w="1521" w:type="dxa"/>
           </w:tcPr>
           <w:p>
             <w:pPr>
@@ -3315,7 +3370,7 @@
         </w:tc>
         <w:tc>
           <w:tcPr>
-            <w:tcW w:w="1545" w:type="dxa"/>
+            <w:tcW w:w="1508" w:type="dxa"/>
           </w:tcPr>
           <w:p>
             <w:pPr>
@@ -3328,11 +3383,9 @@
             </w:pPr>
           </w:p>
         </w:tc>
-      </w:tr>
-      <w:tr>
-        <w:tc>
-          <w:tcPr>
-            <w:tcW w:w="1485" w:type="dxa"/>
+        <w:tc>
+          <w:tcPr>
+            <w:tcW w:w="2244" w:type="dxa"/>
           </w:tcPr>
           <w:p>
             <w:pPr>
@@ -3341,11 +3394,43 @@
                 <w:rFonts w:ascii="Times New Roman" w:hAnsi="Times New Roman" w:cs="Times New Roman"/>
                 <w:sz w:val="24"/>
                 <w:szCs w:val="24"/>
+              </w:rPr>
+            </w:pPr>
+          </w:p>
+        </w:tc>
+        <w:tc>
+          <w:tcPr>
+            <w:tcW w:w="1545" w:type="dxa"/>
+          </w:tcPr>
+          <w:p>
+            <w:pPr>
+              <w:jc w:val="both"/>
+              <w:rPr>
+                <w:rFonts w:ascii="Times New Roman" w:hAnsi="Times New Roman" w:cs="Times New Roman"/>
+                <w:sz w:val="24"/>
+                <w:szCs w:val="24"/>
+              </w:rPr>
+            </w:pPr>
+          </w:p>
+        </w:tc>
+      </w:tr>
+      <w:tr>
+        <w:tc>
+          <w:tcPr>
+            <w:tcW w:w="1485" w:type="dxa"/>
+          </w:tcPr>
+          <w:p>
+            <w:pPr>
+              <w:jc w:val="both"/>
+              <w:rPr>
+                <w:rFonts w:ascii="Times New Roman" w:hAnsi="Times New Roman" w:cs="Times New Roman"/>
+                <w:sz w:val="24"/>
+                <w:szCs w:val="24"/>
                 <w:lang w:val="en-US"/>
               </w:rPr>
             </w:pPr>
             <w:r>
-              <w:t xml:space="preserve">{%tr endfor %}</w:t>
+              <w:t>{%tr endfor %}</w:t>
             </w:r>
           </w:p>
         </w:tc>

</xml_diff>